<commit_message>
feat: send observed advertising totals with model prompts
</commit_message>
<xml_diff>
--- a/docs/产品白皮书.docx
+++ b/docs/产品白皮书.docx
@@ -312,6 +312,19 @@
           <w:sz w:val="22"/>
         </w:rPr>
         <w:t>缓存命中不扣分。连接失败退分。服务商 HTTP 错误不退分。</w:t>
+      </w:r>
+    </w:p>
+    <w:p>
+      <w:pPr>
+        <w:pStyle w:val="ListBullet"/>
+      </w:pPr>
+      <w:r>
+        <w:rPr>
+          <w:rFonts w:ascii="Microsoft YaHei" w:hAnsi="Microsoft YaHei" w:eastAsia="Microsoft YaHei"/>
+          <w:b w:val="0"/>
+          <w:sz w:val="22"/>
+        </w:rPr>
+        <w:t>旧工具的模型提示词带上已发生的花费、销售额、订单、点击和 ACOS。缺失的站点或 ASIN 不编造。提示词明确这些数字不是已节省金额。</w:t>
       </w:r>
     </w:p>
     <w:p/>

</xml_diff>